<commit_message>
PEC PETI PDTI .....
</commit_message>
<xml_diff>
--- a/01 Classes/00 Gestão de Sistemas de Informação - Visão Geral.docx
+++ b/01 Classes/00 Gestão de Sistemas de Informação - Visão Geral.docx
@@ -671,6 +671,7 @@
           <w:rFonts w:ascii="Times New Roman" w:hAnsi="Times New Roman" w:cs="Times New Roman"/>
           <w:b/>
           <w:bCs/>
+          <w:color w:val="EE0000"/>
           <w:sz w:val="24"/>
           <w:szCs w:val="24"/>
         </w:rPr>
@@ -682,6 +683,7 @@
           <w:rFonts w:ascii="Times New Roman" w:hAnsi="Times New Roman" w:cs="Times New Roman"/>
           <w:b/>
           <w:bCs/>
+          <w:color w:val="EE0000"/>
           <w:sz w:val="24"/>
           <w:szCs w:val="24"/>
         </w:rPr>
@@ -693,6 +695,7 @@
           <w:rFonts w:ascii="Times New Roman" w:hAnsi="Times New Roman" w:cs="Times New Roman"/>
           <w:b/>
           <w:bCs/>
+          <w:color w:val="EE0000"/>
           <w:sz w:val="24"/>
           <w:szCs w:val="24"/>
         </w:rPr>
@@ -704,6 +707,7 @@
           <w:rFonts w:ascii="Times New Roman" w:hAnsi="Times New Roman" w:cs="Times New Roman"/>
           <w:b/>
           <w:bCs/>
+          <w:color w:val="EE0000"/>
           <w:sz w:val="24"/>
           <w:szCs w:val="24"/>
         </w:rPr>
@@ -715,6 +719,7 @@
           <w:rFonts w:ascii="Times New Roman" w:hAnsi="Times New Roman" w:cs="Times New Roman"/>
           <w:b/>
           <w:bCs/>
+          <w:color w:val="EE0000"/>
           <w:sz w:val="24"/>
           <w:szCs w:val="24"/>
         </w:rPr>
@@ -775,7 +780,28 @@
           <w:sz w:val="24"/>
           <w:szCs w:val="24"/>
         </w:rPr>
-        <w:t>Análise de dados e indicadores (KPIs)</w:t>
+        <w:t>Análise de dados e indicadores (</w:t>
+      </w:r>
+      <w:r>
+        <w:rPr>
+          <w:rFonts w:ascii="Times New Roman" w:hAnsi="Times New Roman" w:cs="Times New Roman"/>
+          <w:b/>
+          <w:bCs/>
+          <w:color w:val="EE0000"/>
+          <w:sz w:val="24"/>
+          <w:szCs w:val="24"/>
+        </w:rPr>
+        <w:t>KPIs</w:t>
+      </w:r>
+      <w:r>
+        <w:rPr>
+          <w:rFonts w:ascii="Times New Roman" w:hAnsi="Times New Roman" w:cs="Times New Roman"/>
+          <w:b/>
+          <w:bCs/>
+          <w:sz w:val="24"/>
+          <w:szCs w:val="24"/>
+        </w:rPr>
+        <w:t>)</w:t>
       </w:r>
     </w:p>
     <w:p>

</xml_diff>